<commit_message>
Angebot unterschrieben für FVA
</commit_message>
<xml_diff>
--- a/Orga/Angebot_RKurs_FVA.docx
+++ b/Orga/Angebot_RKurs_FVA.docx
@@ -12,17 +12,15 @@
           <w:rFonts w:asciiTheme="minorHAnsi" w:hAnsiTheme="minorHAnsi" w:cstheme="minorHAnsi"/>
           <w:i w:val="0"/>
           <w:iCs w:val="0"/>
-          <w:color w:val="333333"/>
-          <w:szCs w:val="20"/>
-        </w:rPr>
-      </w:pPr>
-      <w:r>
-        <w:rPr>
-          <w:rStyle w:val="Hervorhebung"/>
-          <w:rFonts w:asciiTheme="minorHAnsi" w:hAnsiTheme="minorHAnsi" w:cstheme="minorHAnsi"/>
-          <w:i w:val="0"/>
-          <w:iCs w:val="0"/>
-          <w:color w:val="333333"/>
+          <w:szCs w:val="20"/>
+        </w:rPr>
+      </w:pPr>
+      <w:r>
+        <w:rPr>
+          <w:rStyle w:val="Hervorhebung"/>
+          <w:rFonts w:asciiTheme="minorHAnsi" w:hAnsiTheme="minorHAnsi" w:cstheme="minorHAnsi"/>
+          <w:i w:val="0"/>
+          <w:iCs w:val="0"/>
           <w:szCs w:val="20"/>
         </w:rPr>
         <w:t>Florian</w:t>
@@ -33,7 +31,6 @@
           <w:rFonts w:asciiTheme="minorHAnsi" w:hAnsiTheme="minorHAnsi" w:cstheme="minorHAnsi"/>
           <w:i w:val="0"/>
           <w:iCs w:val="0"/>
-          <w:color w:val="333333"/>
           <w:szCs w:val="20"/>
         </w:rPr>
         <w:t xml:space="preserve"> Keppeler</w:t>
@@ -49,17 +46,15 @@
           <w:rFonts w:asciiTheme="minorHAnsi" w:hAnsiTheme="minorHAnsi" w:cstheme="minorHAnsi"/>
           <w:i w:val="0"/>
           <w:iCs w:val="0"/>
-          <w:color w:val="333333"/>
-          <w:szCs w:val="20"/>
-        </w:rPr>
-      </w:pPr>
-      <w:r>
-        <w:rPr>
-          <w:rStyle w:val="Hervorhebung"/>
-          <w:rFonts w:asciiTheme="minorHAnsi" w:hAnsiTheme="minorHAnsi" w:cstheme="minorHAnsi"/>
-          <w:i w:val="0"/>
-          <w:iCs w:val="0"/>
-          <w:color w:val="333333"/>
+          <w:szCs w:val="20"/>
+        </w:rPr>
+      </w:pPr>
+      <w:r>
+        <w:rPr>
+          <w:rStyle w:val="Hervorhebung"/>
+          <w:rFonts w:asciiTheme="minorHAnsi" w:hAnsiTheme="minorHAnsi" w:cstheme="minorHAnsi"/>
+          <w:i w:val="0"/>
+          <w:iCs w:val="0"/>
           <w:szCs w:val="20"/>
         </w:rPr>
         <w:t>Eugen-Martin-Str. 21 D</w:t>
@@ -75,17 +70,15 @@
           <w:rFonts w:asciiTheme="minorHAnsi" w:hAnsiTheme="minorHAnsi" w:cstheme="minorHAnsi"/>
           <w:i w:val="0"/>
           <w:iCs w:val="0"/>
-          <w:color w:val="333333"/>
-          <w:szCs w:val="20"/>
-        </w:rPr>
-      </w:pPr>
-      <w:r>
-        <w:rPr>
-          <w:rStyle w:val="Hervorhebung"/>
-          <w:rFonts w:asciiTheme="minorHAnsi" w:hAnsiTheme="minorHAnsi" w:cstheme="minorHAnsi"/>
-          <w:i w:val="0"/>
-          <w:iCs w:val="0"/>
-          <w:color w:val="333333"/>
+          <w:szCs w:val="20"/>
+        </w:rPr>
+      </w:pPr>
+      <w:r>
+        <w:rPr>
+          <w:rStyle w:val="Hervorhebung"/>
+          <w:rFonts w:asciiTheme="minorHAnsi" w:hAnsiTheme="minorHAnsi" w:cstheme="minorHAnsi"/>
+          <w:i w:val="0"/>
+          <w:iCs w:val="0"/>
           <w:szCs w:val="20"/>
         </w:rPr>
         <w:t>79106 Freiburg im Breisgau</w:t>
@@ -101,17 +94,15 @@
           <w:rFonts w:asciiTheme="minorHAnsi" w:hAnsiTheme="minorHAnsi" w:cstheme="minorHAnsi"/>
           <w:i w:val="0"/>
           <w:iCs w:val="0"/>
-          <w:color w:val="333333"/>
-          <w:szCs w:val="20"/>
-        </w:rPr>
-      </w:pPr>
-      <w:r>
-        <w:rPr>
-          <w:rStyle w:val="Hervorhebung"/>
-          <w:rFonts w:asciiTheme="minorHAnsi" w:hAnsiTheme="minorHAnsi" w:cstheme="minorHAnsi"/>
-          <w:i w:val="0"/>
-          <w:iCs w:val="0"/>
-          <w:color w:val="333333"/>
+          <w:szCs w:val="20"/>
+        </w:rPr>
+      </w:pPr>
+      <w:r>
+        <w:rPr>
+          <w:rStyle w:val="Hervorhebung"/>
+          <w:rFonts w:asciiTheme="minorHAnsi" w:hAnsiTheme="minorHAnsi" w:cstheme="minorHAnsi"/>
+          <w:i w:val="0"/>
+          <w:iCs w:val="0"/>
           <w:szCs w:val="20"/>
         </w:rPr>
         <w:t>Freiburg im Breisgau</w:t>
@@ -122,7 +113,6 @@
           <w:rFonts w:asciiTheme="minorHAnsi" w:hAnsiTheme="minorHAnsi" w:cstheme="minorHAnsi"/>
           <w:i w:val="0"/>
           <w:iCs w:val="0"/>
-          <w:color w:val="333333"/>
           <w:szCs w:val="20"/>
         </w:rPr>
         <w:t>,</w:t>
@@ -133,7 +123,6 @@
           <w:rFonts w:asciiTheme="minorHAnsi" w:hAnsiTheme="minorHAnsi" w:cstheme="minorHAnsi"/>
           <w:i w:val="0"/>
           <w:iCs w:val="0"/>
-          <w:color w:val="333333"/>
           <w:szCs w:val="20"/>
         </w:rPr>
         <w:t xml:space="preserve"> </w:t>
@@ -144,7 +133,6 @@
           <w:rFonts w:asciiTheme="minorHAnsi" w:hAnsiTheme="minorHAnsi" w:cstheme="minorHAnsi"/>
           <w:i w:val="0"/>
           <w:iCs w:val="0"/>
-          <w:color w:val="333333"/>
           <w:szCs w:val="20"/>
         </w:rPr>
         <w:t>29</w:t>
@@ -155,7 +143,6 @@
           <w:rFonts w:asciiTheme="minorHAnsi" w:hAnsiTheme="minorHAnsi" w:cstheme="minorHAnsi"/>
           <w:i w:val="0"/>
           <w:iCs w:val="0"/>
-          <w:color w:val="333333"/>
           <w:szCs w:val="20"/>
         </w:rPr>
         <w:t>.</w:t>
@@ -166,7 +153,6 @@
           <w:rFonts w:asciiTheme="minorHAnsi" w:hAnsiTheme="minorHAnsi" w:cstheme="minorHAnsi"/>
           <w:i w:val="0"/>
           <w:iCs w:val="0"/>
-          <w:color w:val="333333"/>
           <w:szCs w:val="20"/>
         </w:rPr>
         <w:t>04</w:t>
@@ -177,7 +163,6 @@
           <w:rFonts w:asciiTheme="minorHAnsi" w:hAnsiTheme="minorHAnsi" w:cstheme="minorHAnsi"/>
           <w:i w:val="0"/>
           <w:iCs w:val="0"/>
-          <w:color w:val="333333"/>
           <w:szCs w:val="20"/>
         </w:rPr>
         <w:t>.202</w:t>
@@ -188,7 +173,6 @@
           <w:rFonts w:asciiTheme="minorHAnsi" w:hAnsiTheme="minorHAnsi" w:cstheme="minorHAnsi"/>
           <w:i w:val="0"/>
           <w:iCs w:val="0"/>
-          <w:color w:val="333333"/>
           <w:szCs w:val="20"/>
         </w:rPr>
         <w:t>5</w:t>
@@ -207,7 +191,6 @@
           <w:rFonts w:asciiTheme="minorHAnsi" w:hAnsiTheme="minorHAnsi" w:cstheme="minorHAnsi"/>
           <w:i w:val="0"/>
           <w:iCs w:val="0"/>
-          <w:color w:val="333333"/>
           <w:szCs w:val="20"/>
         </w:rPr>
       </w:pPr>
@@ -215,7 +198,6 @@
         <w:rPr>
           <w:rFonts w:asciiTheme="minorHAnsi" w:hAnsiTheme="minorHAnsi" w:cstheme="minorHAnsi"/>
           <w:noProof/>
-          <w:color w:val="333333"/>
           <w:szCs w:val="20"/>
         </w:rPr>
         <mc:AlternateContent>
@@ -275,14 +257,7 @@
                                 <w:sz w:val="24"/>
                                 <w:szCs w:val="24"/>
                               </w:rPr>
-                              <w:t xml:space="preserve">Dr. </w:t>
-                            </w:r>
-                            <w:r>
-                              <w:rPr>
-                                <w:sz w:val="24"/>
-                                <w:szCs w:val="24"/>
-                              </w:rPr>
-                              <w:t>Petra Adler</w:t>
+                              <w:t>Anne-Sophie Stelzer</w:t>
                             </w:r>
                           </w:p>
                           <w:p>
@@ -425,14 +400,7 @@
                           <w:sz w:val="24"/>
                           <w:szCs w:val="24"/>
                         </w:rPr>
-                        <w:t xml:space="preserve">Dr. </w:t>
-                      </w:r>
-                      <w:r>
-                        <w:rPr>
-                          <w:sz w:val="24"/>
-                          <w:szCs w:val="24"/>
-                        </w:rPr>
-                        <w:t>Petra Adler</w:t>
+                        <w:t>Anne-Sophie Stelzer</w:t>
                       </w:r>
                     </w:p>
                     <w:p>
@@ -550,7 +518,6 @@
           <w:rFonts w:asciiTheme="minorHAnsi" w:hAnsiTheme="minorHAnsi" w:cstheme="minorHAnsi"/>
           <w:i w:val="0"/>
           <w:iCs w:val="0"/>
-          <w:color w:val="333333"/>
           <w:szCs w:val="20"/>
         </w:rPr>
         <w:tab/>
@@ -566,17 +533,15 @@
           <w:rFonts w:asciiTheme="minorHAnsi" w:hAnsiTheme="minorHAnsi" w:cstheme="minorHAnsi"/>
           <w:i w:val="0"/>
           <w:iCs w:val="0"/>
-          <w:color w:val="333333"/>
-          <w:szCs w:val="20"/>
-        </w:rPr>
-      </w:pPr>
-      <w:r>
-        <w:rPr>
-          <w:rStyle w:val="Hervorhebung"/>
-          <w:rFonts w:asciiTheme="minorHAnsi" w:hAnsiTheme="minorHAnsi" w:cstheme="minorHAnsi"/>
-          <w:i w:val="0"/>
-          <w:iCs w:val="0"/>
-          <w:color w:val="333333"/>
+          <w:szCs w:val="20"/>
+        </w:rPr>
+      </w:pPr>
+      <w:r>
+        <w:rPr>
+          <w:rStyle w:val="Hervorhebung"/>
+          <w:rFonts w:asciiTheme="minorHAnsi" w:hAnsiTheme="minorHAnsi" w:cstheme="minorHAnsi"/>
+          <w:i w:val="0"/>
+          <w:iCs w:val="0"/>
           <w:szCs w:val="20"/>
         </w:rPr>
         <w:t>Volksbank Ammerbuch eG</w:t>
@@ -589,17 +554,15 @@
         <w:ind w:left="5670" w:right="142" w:firstLine="290"/>
         <w:rPr>
           <w:rFonts w:asciiTheme="minorHAnsi" w:hAnsiTheme="minorHAnsi" w:cstheme="minorHAnsi"/>
-          <w:color w:val="333333"/>
-          <w:szCs w:val="20"/>
-        </w:rPr>
-      </w:pPr>
-      <w:r>
-        <w:rPr>
-          <w:rStyle w:val="Hervorhebung"/>
-          <w:rFonts w:asciiTheme="minorHAnsi" w:hAnsiTheme="minorHAnsi" w:cstheme="minorHAnsi"/>
-          <w:i w:val="0"/>
-          <w:iCs w:val="0"/>
-          <w:color w:val="333333"/>
+          <w:szCs w:val="20"/>
+        </w:rPr>
+      </w:pPr>
+      <w:r>
+        <w:rPr>
+          <w:rStyle w:val="Hervorhebung"/>
+          <w:rFonts w:asciiTheme="minorHAnsi" w:hAnsiTheme="minorHAnsi" w:cstheme="minorHAnsi"/>
+          <w:i w:val="0"/>
+          <w:iCs w:val="0"/>
           <w:szCs w:val="20"/>
         </w:rPr>
         <w:t xml:space="preserve">IBAN </w:t>
@@ -610,7 +573,6 @@
           <w:rFonts w:asciiTheme="minorHAnsi" w:hAnsiTheme="minorHAnsi" w:cstheme="minorHAnsi"/>
           <w:i w:val="0"/>
           <w:iCs w:val="0"/>
-          <w:color w:val="333333"/>
           <w:szCs w:val="20"/>
         </w:rPr>
         <w:t>DE37641613970063433001</w:t>
@@ -626,17 +588,15 @@
           <w:rFonts w:asciiTheme="minorHAnsi" w:hAnsiTheme="minorHAnsi" w:cstheme="minorHAnsi"/>
           <w:i w:val="0"/>
           <w:iCs w:val="0"/>
-          <w:color w:val="333333"/>
-          <w:szCs w:val="20"/>
-        </w:rPr>
-      </w:pPr>
-      <w:r>
-        <w:rPr>
-          <w:rStyle w:val="Hervorhebung"/>
-          <w:rFonts w:asciiTheme="minorHAnsi" w:hAnsiTheme="minorHAnsi" w:cstheme="minorHAnsi"/>
-          <w:i w:val="0"/>
-          <w:iCs w:val="0"/>
-          <w:color w:val="333333"/>
+          <w:szCs w:val="20"/>
+        </w:rPr>
+      </w:pPr>
+      <w:r>
+        <w:rPr>
+          <w:rStyle w:val="Hervorhebung"/>
+          <w:rFonts w:asciiTheme="minorHAnsi" w:hAnsiTheme="minorHAnsi" w:cstheme="minorHAnsi"/>
+          <w:i w:val="0"/>
+          <w:iCs w:val="0"/>
           <w:szCs w:val="20"/>
         </w:rPr>
         <w:t>BIC GENODES1AMM</w:t>
@@ -652,7 +612,6 @@
           <w:rFonts w:asciiTheme="minorHAnsi" w:hAnsiTheme="minorHAnsi" w:cstheme="minorHAnsi"/>
           <w:i w:val="0"/>
           <w:iCs w:val="0"/>
-          <w:color w:val="333333"/>
           <w:szCs w:val="20"/>
         </w:rPr>
       </w:pPr>
@@ -667,17 +626,15 @@
           <w:rFonts w:asciiTheme="minorHAnsi" w:hAnsiTheme="minorHAnsi" w:cstheme="minorHAnsi"/>
           <w:i w:val="0"/>
           <w:iCs w:val="0"/>
-          <w:color w:val="333333"/>
-          <w:szCs w:val="20"/>
-        </w:rPr>
-      </w:pPr>
-      <w:r>
-        <w:rPr>
-          <w:rStyle w:val="Hervorhebung"/>
-          <w:rFonts w:asciiTheme="minorHAnsi" w:hAnsiTheme="minorHAnsi" w:cstheme="minorHAnsi"/>
-          <w:i w:val="0"/>
-          <w:iCs w:val="0"/>
-          <w:color w:val="333333"/>
+          <w:szCs w:val="20"/>
+        </w:rPr>
+      </w:pPr>
+      <w:r>
+        <w:rPr>
+          <w:rStyle w:val="Hervorhebung"/>
+          <w:rFonts w:asciiTheme="minorHAnsi" w:hAnsiTheme="minorHAnsi" w:cstheme="minorHAnsi"/>
+          <w:i w:val="0"/>
+          <w:iCs w:val="0"/>
           <w:szCs w:val="20"/>
         </w:rPr>
         <w:t>Finanzamt Freiburg</w:t>
@@ -693,17 +650,15 @@
           <w:rFonts w:asciiTheme="minorHAnsi" w:hAnsiTheme="minorHAnsi" w:cstheme="minorHAnsi"/>
           <w:i w:val="0"/>
           <w:iCs w:val="0"/>
-          <w:color w:val="333333"/>
-          <w:szCs w:val="20"/>
-        </w:rPr>
-      </w:pPr>
-      <w:r>
-        <w:rPr>
-          <w:rStyle w:val="Hervorhebung"/>
-          <w:rFonts w:asciiTheme="minorHAnsi" w:hAnsiTheme="minorHAnsi" w:cstheme="minorHAnsi"/>
-          <w:i w:val="0"/>
-          <w:iCs w:val="0"/>
-          <w:color w:val="333333"/>
+          <w:szCs w:val="20"/>
+        </w:rPr>
+      </w:pPr>
+      <w:r>
+        <w:rPr>
+          <w:rStyle w:val="Hervorhebung"/>
+          <w:rFonts w:asciiTheme="minorHAnsi" w:hAnsiTheme="minorHAnsi" w:cstheme="minorHAnsi"/>
+          <w:i w:val="0"/>
+          <w:iCs w:val="0"/>
           <w:szCs w:val="20"/>
         </w:rPr>
         <w:t xml:space="preserve">Ident.nr.: </w:t>
@@ -714,7 +669,6 @@
           <w:rFonts w:asciiTheme="minorHAnsi" w:hAnsiTheme="minorHAnsi" w:cstheme="minorHAnsi"/>
           <w:i w:val="0"/>
           <w:iCs w:val="0"/>
-          <w:color w:val="333333"/>
           <w:szCs w:val="20"/>
         </w:rPr>
         <w:t>75271436084</w:t>
@@ -726,7 +680,6 @@
         <w:spacing w:line="285" w:lineRule="atLeast"/>
         <w:rPr>
           <w:rFonts w:asciiTheme="minorHAnsi" w:hAnsiTheme="minorHAnsi" w:cstheme="minorHAnsi"/>
-          <w:color w:val="333333"/>
           <w:szCs w:val="20"/>
         </w:rPr>
       </w:pPr>
@@ -750,7 +703,6 @@
           <w:bCs/>
           <w:i w:val="0"/>
           <w:iCs w:val="0"/>
-          <w:color w:val="333333"/>
         </w:rPr>
         <w:t xml:space="preserve">Angebot – </w:t>
       </w:r>
@@ -770,17 +722,29 @@
         <w:ind w:right="142"/>
         <w:rPr>
           <w:rFonts w:asciiTheme="minorHAnsi" w:hAnsiTheme="minorHAnsi" w:cstheme="minorHAnsi"/>
-          <w:color w:val="333333"/>
-          <w:szCs w:val="20"/>
-        </w:rPr>
-      </w:pPr>
-      <w:r>
-        <w:rPr>
-          <w:rFonts w:asciiTheme="minorHAnsi" w:hAnsiTheme="minorHAnsi" w:cstheme="minorHAnsi"/>
-          <w:color w:val="333333"/>
-          <w:szCs w:val="20"/>
-        </w:rPr>
-        <w:t>Sehr geehrte Frau Dr. Adler,</w:t>
+          <w:szCs w:val="20"/>
+        </w:rPr>
+      </w:pPr>
+      <w:r>
+        <w:rPr>
+          <w:rFonts w:asciiTheme="minorHAnsi" w:hAnsiTheme="minorHAnsi" w:cstheme="minorHAnsi"/>
+          <w:szCs w:val="20"/>
+        </w:rPr>
+        <w:t xml:space="preserve">Sehr geehrte Frau </w:t>
+      </w:r>
+      <w:r>
+        <w:rPr>
+          <w:rFonts w:asciiTheme="minorHAnsi" w:hAnsiTheme="minorHAnsi" w:cstheme="minorHAnsi"/>
+          <w:szCs w:val="20"/>
+        </w:rPr>
+        <w:t>Stelzer</w:t>
+      </w:r>
+      <w:r>
+        <w:rPr>
+          <w:rFonts w:asciiTheme="minorHAnsi" w:hAnsiTheme="minorHAnsi" w:cstheme="minorHAnsi"/>
+          <w:szCs w:val="20"/>
+        </w:rPr>
+        <w:t>,</w:t>
       </w:r>
     </w:p>
     <w:p>
@@ -790,14 +754,12 @@
         <w:ind w:right="142"/>
         <w:rPr>
           <w:rFonts w:asciiTheme="minorHAnsi" w:hAnsiTheme="minorHAnsi" w:cstheme="minorHAnsi"/>
-          <w:color w:val="333333"/>
-          <w:szCs w:val="20"/>
-        </w:rPr>
-      </w:pPr>
-      <w:r>
-        <w:rPr>
-          <w:rFonts w:asciiTheme="minorHAnsi" w:hAnsiTheme="minorHAnsi" w:cstheme="minorHAnsi"/>
-          <w:color w:val="333333"/>
+          <w:szCs w:val="20"/>
+        </w:rPr>
+      </w:pPr>
+      <w:r>
+        <w:rPr>
+          <w:rFonts w:asciiTheme="minorHAnsi" w:hAnsiTheme="minorHAnsi" w:cstheme="minorHAnsi"/>
           <w:szCs w:val="20"/>
         </w:rPr>
         <w:t xml:space="preserve">Ich freue mich, Ihnen eine spezifisch auf Ihre Anforderungen zugeschnittene R Schulung mit </w:t>
@@ -805,7 +767,6 @@
       <w:r>
         <w:rPr>
           <w:rFonts w:asciiTheme="minorHAnsi" w:hAnsiTheme="minorHAnsi" w:cstheme="minorHAnsi"/>
-          <w:color w:val="333333"/>
           <w:szCs w:val="20"/>
         </w:rPr>
         <w:t xml:space="preserve">dem </w:t>
@@ -813,7 +774,6 @@
       <w:r>
         <w:rPr>
           <w:rFonts w:asciiTheme="minorHAnsi" w:hAnsiTheme="minorHAnsi" w:cstheme="minorHAnsi"/>
-          <w:color w:val="333333"/>
           <w:szCs w:val="20"/>
         </w:rPr>
         <w:t>Schwerpunkt Auswertung von Inventuren, insbesondere der BWI, wie folgt anbieten zu können:</w:t>
@@ -855,7 +815,6 @@
                 <w:rFonts w:asciiTheme="minorHAnsi" w:hAnsiTheme="minorHAnsi" w:cstheme="minorHAnsi"/>
                 <w:b/>
                 <w:bCs/>
-                <w:color w:val="333333"/>
                 <w:szCs w:val="20"/>
               </w:rPr>
             </w:pPr>
@@ -874,7 +833,6 @@
                 <w:rFonts w:asciiTheme="minorHAnsi" w:hAnsiTheme="minorHAnsi" w:cstheme="minorHAnsi"/>
                 <w:b/>
                 <w:bCs/>
-                <w:color w:val="333333"/>
                 <w:szCs w:val="20"/>
               </w:rPr>
             </w:pPr>
@@ -900,7 +858,6 @@
                 <w:rFonts w:asciiTheme="minorHAnsi" w:hAnsiTheme="minorHAnsi" w:cstheme="minorHAnsi"/>
                 <w:b/>
                 <w:bCs/>
-                <w:color w:val="333333"/>
                 <w:szCs w:val="20"/>
               </w:rPr>
             </w:pPr>
@@ -909,7 +866,6 @@
                 <w:rFonts w:asciiTheme="minorHAnsi" w:hAnsiTheme="minorHAnsi" w:cstheme="minorHAnsi"/>
                 <w:b/>
                 <w:bCs/>
-                <w:color w:val="333333"/>
                 <w:szCs w:val="20"/>
               </w:rPr>
               <w:t>Anzahl</w:t>
@@ -921,14 +877,12 @@
               <w:spacing w:after="0" w:afterAutospacing="0" w:line="285" w:lineRule="atLeast"/>
               <w:rPr>
                 <w:rFonts w:asciiTheme="minorHAnsi" w:hAnsiTheme="minorHAnsi" w:cstheme="minorHAnsi"/>
-                <w:color w:val="333333"/>
                 <w:szCs w:val="20"/>
               </w:rPr>
             </w:pPr>
             <w:r>
               <w:rPr>
                 <w:rFonts w:asciiTheme="minorHAnsi" w:hAnsiTheme="minorHAnsi" w:cstheme="minorHAnsi"/>
-                <w:color w:val="333333"/>
                 <w:szCs w:val="20"/>
               </w:rPr>
               <w:t>3</w:t>
@@ -950,7 +904,6 @@
                 <w:rFonts w:asciiTheme="minorHAnsi" w:hAnsiTheme="minorHAnsi" w:cstheme="minorHAnsi"/>
                 <w:b/>
                 <w:bCs/>
-                <w:color w:val="333333"/>
                 <w:szCs w:val="20"/>
               </w:rPr>
             </w:pPr>
@@ -959,7 +912,6 @@
                 <w:rFonts w:asciiTheme="minorHAnsi" w:hAnsiTheme="minorHAnsi" w:cstheme="minorHAnsi"/>
                 <w:b/>
                 <w:bCs/>
-                <w:color w:val="333333"/>
                 <w:szCs w:val="20"/>
               </w:rPr>
               <w:t>Bezeichnung</w:t>
@@ -1078,41 +1030,15 @@
               <w:spacing w:line="285" w:lineRule="atLeast"/>
               <w:rPr>
                 <w:rFonts w:asciiTheme="minorHAnsi" w:hAnsiTheme="minorHAnsi" w:cstheme="minorHAnsi"/>
-                <w:color w:val="333333"/>
                 <w:szCs w:val="20"/>
               </w:rPr>
             </w:pPr>
             <w:r>
               <w:rPr>
                 <w:rFonts w:asciiTheme="minorHAnsi" w:hAnsiTheme="minorHAnsi" w:cstheme="minorHAnsi"/>
-                <w:color w:val="333333"/>
                 <w:szCs w:val="20"/>
               </w:rPr>
-              <w:t>382</w:t>
-            </w:r>
-            <w:r>
-              <w:rPr>
-                <w:rFonts w:asciiTheme="minorHAnsi" w:hAnsiTheme="minorHAnsi" w:cstheme="minorHAnsi"/>
-                <w:color w:val="333333"/>
-                <w:szCs w:val="20"/>
-              </w:rPr>
-              <w:t>,</w:t>
-            </w:r>
-            <w:r>
-              <w:rPr>
-                <w:rFonts w:asciiTheme="minorHAnsi" w:hAnsiTheme="minorHAnsi" w:cstheme="minorHAnsi"/>
-                <w:color w:val="333333"/>
-                <w:szCs w:val="20"/>
-              </w:rPr>
-              <w:t>5</w:t>
-            </w:r>
-            <w:r>
-              <w:rPr>
-                <w:rFonts w:asciiTheme="minorHAnsi" w:hAnsiTheme="minorHAnsi" w:cstheme="minorHAnsi"/>
-                <w:color w:val="333333"/>
-                <w:szCs w:val="20"/>
-              </w:rPr>
-              <w:t>0</w:t>
+              <w:t>382,50</w:t>
             </w:r>
           </w:p>
         </w:tc>
@@ -1132,7 +1058,6 @@
                 <w:rFonts w:asciiTheme="minorHAnsi" w:hAnsiTheme="minorHAnsi" w:cstheme="minorHAnsi"/>
                 <w:b/>
                 <w:bCs/>
-                <w:color w:val="333333"/>
                 <w:szCs w:val="20"/>
               </w:rPr>
             </w:pPr>
@@ -1142,7 +1067,6 @@
                 <w:rFonts w:asciiTheme="minorHAnsi" w:hAnsiTheme="minorHAnsi" w:cstheme="minorHAnsi"/>
                 <w:b/>
                 <w:bCs/>
-                <w:color w:val="333333"/>
                 <w:szCs w:val="20"/>
               </w:rPr>
               <w:t>GPreis</w:t>
@@ -1153,7 +1077,6 @@
                 <w:rFonts w:asciiTheme="minorHAnsi" w:hAnsiTheme="minorHAnsi" w:cstheme="minorHAnsi"/>
                 <w:b/>
                 <w:bCs/>
-                <w:color w:val="333333"/>
                 <w:szCs w:val="20"/>
               </w:rPr>
               <w:t>/€</w:t>
@@ -1166,25 +1089,15 @@
               <w:jc w:val="right"/>
               <w:rPr>
                 <w:rFonts w:asciiTheme="minorHAnsi" w:hAnsiTheme="minorHAnsi" w:cstheme="minorHAnsi"/>
-                <w:color w:val="333333"/>
                 <w:szCs w:val="20"/>
               </w:rPr>
             </w:pPr>
             <w:r>
               <w:rPr>
                 <w:rFonts w:asciiTheme="minorHAnsi" w:hAnsiTheme="minorHAnsi" w:cstheme="minorHAnsi"/>
-                <w:color w:val="333333"/>
                 <w:szCs w:val="20"/>
               </w:rPr>
-              <w:t>1147</w:t>
-            </w:r>
-            <w:r>
-              <w:rPr>
-                <w:rFonts w:asciiTheme="minorHAnsi" w:hAnsiTheme="minorHAnsi" w:cstheme="minorHAnsi"/>
-                <w:color w:val="333333"/>
-                <w:szCs w:val="20"/>
-              </w:rPr>
-              <w:t>,50</w:t>
+              <w:t>1147,50</w:t>
             </w:r>
           </w:p>
         </w:tc>
@@ -1208,7 +1121,6 @@
                 <w:rFonts w:asciiTheme="minorHAnsi" w:hAnsiTheme="minorHAnsi" w:cstheme="minorHAnsi"/>
                 <w:b/>
                 <w:bCs/>
-                <w:color w:val="333333"/>
                 <w:szCs w:val="20"/>
               </w:rPr>
             </w:pPr>
@@ -1229,7 +1141,6 @@
                 <w:rFonts w:asciiTheme="minorHAnsi" w:hAnsiTheme="minorHAnsi" w:cstheme="minorHAnsi"/>
                 <w:b/>
                 <w:bCs/>
-                <w:color w:val="333333"/>
                 <w:szCs w:val="20"/>
               </w:rPr>
             </w:pPr>
@@ -1257,7 +1168,6 @@
                 <w:rFonts w:asciiTheme="minorHAnsi" w:hAnsiTheme="minorHAnsi" w:cstheme="minorHAnsi"/>
                 <w:b/>
                 <w:bCs/>
-                <w:color w:val="333333"/>
                 <w:szCs w:val="20"/>
               </w:rPr>
               <w:t xml:space="preserve"> </w:t>
@@ -1268,23 +1178,7 @@
                 <w:b/>
                 <w:bCs/>
               </w:rPr>
-              <w:t xml:space="preserve"> </w:t>
-            </w:r>
-            <w:r>
-              <w:rPr>
-                <w:rFonts w:asciiTheme="minorHAnsi" w:hAnsiTheme="minorHAnsi" w:cstheme="minorHAnsi"/>
-                <w:b/>
-                <w:bCs/>
-              </w:rPr>
-              <w:t>Gesamt</w:t>
-            </w:r>
-            <w:r>
-              <w:rPr>
-                <w:rFonts w:asciiTheme="minorHAnsi" w:hAnsiTheme="minorHAnsi" w:cstheme="minorHAnsi"/>
-                <w:b/>
-                <w:bCs/>
-              </w:rPr>
-              <w:t xml:space="preserve">                                                        </w:t>
+              <w:t xml:space="preserve"> Gesamt                                                        </w:t>
             </w:r>
           </w:p>
           <w:p>
@@ -1296,7 +1190,6 @@
                 <w:rFonts w:asciiTheme="minorHAnsi" w:hAnsiTheme="minorHAnsi" w:cstheme="minorHAnsi"/>
                 <w:b/>
                 <w:bCs/>
-                <w:color w:val="333333"/>
                 <w:szCs w:val="20"/>
               </w:rPr>
             </w:pPr>
@@ -1318,7 +1211,6 @@
                 <w:rFonts w:asciiTheme="minorHAnsi" w:hAnsiTheme="minorHAnsi" w:cstheme="minorHAnsi"/>
                 <w:b/>
                 <w:bCs/>
-                <w:color w:val="333333"/>
                 <w:szCs w:val="20"/>
               </w:rPr>
             </w:pPr>
@@ -1327,30 +1219,9 @@
                 <w:rFonts w:asciiTheme="minorHAnsi" w:hAnsiTheme="minorHAnsi" w:cstheme="minorHAnsi"/>
                 <w:b/>
                 <w:bCs/>
-                <w:color w:val="333333"/>
                 <w:szCs w:val="20"/>
               </w:rPr>
-              <w:t>1147,50</w:t>
-            </w:r>
-            <w:r>
-              <w:rPr>
-                <w:rFonts w:asciiTheme="minorHAnsi" w:hAnsiTheme="minorHAnsi" w:cstheme="minorHAnsi"/>
-                <w:b/>
-                <w:bCs/>
-                <w:color w:val="333333"/>
-                <w:szCs w:val="20"/>
-              </w:rPr>
-              <w:t xml:space="preserve"> </w:t>
-            </w:r>
-            <w:r>
-              <w:rPr>
-                <w:rFonts w:asciiTheme="minorHAnsi" w:hAnsiTheme="minorHAnsi" w:cstheme="minorHAnsi"/>
-                <w:b/>
-                <w:bCs/>
-                <w:color w:val="333333"/>
-                <w:szCs w:val="20"/>
-              </w:rPr>
-              <w:t>€</w:t>
+              <w:t>1147,50 €</w:t>
             </w:r>
           </w:p>
           <w:p>
@@ -1362,7 +1233,6 @@
                 <w:rFonts w:asciiTheme="minorHAnsi" w:hAnsiTheme="minorHAnsi" w:cstheme="minorHAnsi"/>
                 <w:b/>
                 <w:bCs/>
-                <w:color w:val="333333"/>
                 <w:szCs w:val="20"/>
               </w:rPr>
             </w:pPr>
@@ -1376,33 +1246,15 @@
         <w:spacing w:after="0" w:afterAutospacing="0" w:line="285" w:lineRule="atLeast"/>
         <w:rPr>
           <w:rFonts w:asciiTheme="minorHAnsi" w:hAnsiTheme="minorHAnsi" w:cstheme="minorHAnsi"/>
-          <w:color w:val="333333"/>
-          <w:szCs w:val="20"/>
-        </w:rPr>
-      </w:pPr>
-      <w:r>
-        <w:rPr>
-          <w:rFonts w:asciiTheme="minorHAnsi" w:hAnsiTheme="minorHAnsi" w:cstheme="minorHAnsi"/>
-          <w:color w:val="333333"/>
-          <w:szCs w:val="20"/>
-        </w:rPr>
-        <w:t xml:space="preserve">Aufgrund § 19 </w:t>
-      </w:r>
-      <w:r>
-        <w:rPr>
-          <w:rFonts w:asciiTheme="minorHAnsi" w:hAnsiTheme="minorHAnsi" w:cstheme="minorHAnsi"/>
-          <w:color w:val="333333"/>
-          <w:szCs w:val="20"/>
-        </w:rPr>
-        <w:t>UStG</w:t>
-      </w:r>
-      <w:r>
-        <w:rPr>
-          <w:rFonts w:asciiTheme="minorHAnsi" w:hAnsiTheme="minorHAnsi" w:cstheme="minorHAnsi"/>
-          <w:color w:val="333333"/>
-          <w:szCs w:val="20"/>
-        </w:rPr>
-        <w:t xml:space="preserve"> entfällt die Umsatzsteuer und wird daraufhin nicht ausgewiesen. </w:t>
+          <w:szCs w:val="20"/>
+        </w:rPr>
+      </w:pPr>
+      <w:r>
+        <w:rPr>
+          <w:rFonts w:asciiTheme="minorHAnsi" w:hAnsiTheme="minorHAnsi" w:cstheme="minorHAnsi"/>
+          <w:szCs w:val="20"/>
+        </w:rPr>
+        <w:t xml:space="preserve">Aufgrund § 19 UStG entfällt die Umsatzsteuer und wird daraufhin nicht ausgewiesen. </w:t>
       </w:r>
     </w:p>
     <w:p>
@@ -1413,7 +1265,6 @@
           <w:rFonts w:asciiTheme="minorHAnsi" w:hAnsiTheme="minorHAnsi" w:cstheme="minorHAnsi"/>
           <w:b/>
           <w:bCs/>
-          <w:color w:val="333333"/>
           <w:szCs w:val="20"/>
         </w:rPr>
       </w:pPr>
@@ -1422,7 +1273,6 @@
           <w:rFonts w:asciiTheme="minorHAnsi" w:hAnsiTheme="minorHAnsi" w:cstheme="minorHAnsi"/>
           <w:b/>
           <w:bCs/>
-          <w:color w:val="333333"/>
           <w:szCs w:val="20"/>
         </w:rPr>
         <w:t>Schulungsort und Technik</w:t>
@@ -1434,38 +1284,19 @@
         <w:spacing w:line="285" w:lineRule="atLeast"/>
         <w:rPr>
           <w:rFonts w:asciiTheme="minorHAnsi" w:hAnsiTheme="minorHAnsi" w:cstheme="minorHAnsi"/>
-          <w:color w:val="333333"/>
-          <w:szCs w:val="20"/>
-        </w:rPr>
-      </w:pPr>
-      <w:r>
-        <w:rPr>
-          <w:rFonts w:asciiTheme="minorHAnsi" w:hAnsiTheme="minorHAnsi" w:cstheme="minorHAnsi"/>
-          <w:color w:val="333333"/>
-          <w:szCs w:val="20"/>
-        </w:rPr>
-        <w:t xml:space="preserve">Die Schulung findet vor Ort in der Forstlichen Versuchs- und Forschungsanstalt BW statt. </w:t>
-      </w:r>
-      <w:r>
-        <w:rPr>
-          <w:rFonts w:asciiTheme="minorHAnsi" w:hAnsiTheme="minorHAnsi" w:cstheme="minorHAnsi"/>
-          <w:color w:val="333333"/>
-          <w:szCs w:val="20"/>
-        </w:rPr>
-        <w:t>Ein adäquat ausgestatteter Seminarraum wird von Ihnen als Auftraggeber zur Verfügung gestellt.</w:t>
-      </w:r>
-      <w:r>
-        <w:rPr>
-          <w:rFonts w:asciiTheme="minorHAnsi" w:hAnsiTheme="minorHAnsi" w:cstheme="minorHAnsi"/>
-          <w:color w:val="333333"/>
-          <w:szCs w:val="20"/>
-        </w:rPr>
-        <w:t xml:space="preserve"> Ebenso verfügen die, an der Schulung teilnehmenden Mitarbeiter, bereits über entsprechende Hardware mit der aktuellsten Installation von R</w:t>
-      </w:r>
-      <w:r>
-        <w:rPr>
-          <w:rFonts w:asciiTheme="minorHAnsi" w:hAnsiTheme="minorHAnsi" w:cstheme="minorHAnsi"/>
-          <w:color w:val="333333"/>
+          <w:szCs w:val="20"/>
+        </w:rPr>
+      </w:pPr>
+      <w:r>
+        <w:rPr>
+          <w:rFonts w:asciiTheme="minorHAnsi" w:hAnsiTheme="minorHAnsi" w:cstheme="minorHAnsi"/>
+          <w:szCs w:val="20"/>
+        </w:rPr>
+        <w:t>Die Schulung findet vor Ort in der Forstlichen Versuchs- und Forschungsanstalt BW statt. Ein adäquat ausgestatteter Seminarraum wird von Ihnen als Auftraggeber zur Verfügung gestellt. Ebenso verfügen die, an der Schulung teilnehmenden Mitarbeiter, bereits über entsprechende Hardware mit der aktuellsten Installation von R</w:t>
+      </w:r>
+      <w:r>
+        <w:rPr>
+          <w:rFonts w:asciiTheme="minorHAnsi" w:hAnsiTheme="minorHAnsi" w:cstheme="minorHAnsi"/>
           <w:szCs w:val="20"/>
         </w:rPr>
         <w:t xml:space="preserve"> (mindestens Version 4.1.0)</w:t>
@@ -1473,7 +1304,6 @@
       <w:r>
         <w:rPr>
           <w:rFonts w:asciiTheme="minorHAnsi" w:hAnsiTheme="minorHAnsi" w:cstheme="minorHAnsi"/>
-          <w:color w:val="333333"/>
           <w:szCs w:val="20"/>
         </w:rPr>
         <w:t xml:space="preserve"> und der Entwicklungsumgebung </w:t>
@@ -1482,7 +1312,6 @@
       <w:r>
         <w:rPr>
           <w:rFonts w:asciiTheme="minorHAnsi" w:hAnsiTheme="minorHAnsi" w:cstheme="minorHAnsi"/>
-          <w:color w:val="333333"/>
           <w:szCs w:val="20"/>
         </w:rPr>
         <w:t>RStudio</w:t>
@@ -1491,7 +1320,6 @@
       <w:r>
         <w:rPr>
           <w:rFonts w:asciiTheme="minorHAnsi" w:hAnsiTheme="minorHAnsi" w:cstheme="minorHAnsi"/>
-          <w:color w:val="333333"/>
           <w:szCs w:val="20"/>
         </w:rPr>
         <w:t xml:space="preserve">. </w:t>
@@ -1503,7 +1331,6 @@
         <w:spacing w:line="285" w:lineRule="atLeast"/>
         <w:rPr>
           <w:rFonts w:asciiTheme="minorHAnsi" w:hAnsiTheme="minorHAnsi" w:cstheme="minorHAnsi"/>
-          <w:color w:val="333333"/>
           <w:szCs w:val="20"/>
         </w:rPr>
       </w:pPr>
@@ -1516,7 +1343,6 @@
           <w:rFonts w:asciiTheme="minorHAnsi" w:hAnsiTheme="minorHAnsi" w:cstheme="minorHAnsi"/>
           <w:b/>
           <w:bCs/>
-          <w:color w:val="333333"/>
           <w:szCs w:val="20"/>
         </w:rPr>
       </w:pPr>
@@ -1525,7 +1351,6 @@
           <w:rFonts w:asciiTheme="minorHAnsi" w:hAnsiTheme="minorHAnsi" w:cstheme="minorHAnsi"/>
           <w:b/>
           <w:bCs/>
-          <w:color w:val="333333"/>
           <w:szCs w:val="20"/>
         </w:rPr>
         <w:lastRenderedPageBreak/>
@@ -1538,14 +1363,12 @@
         <w:spacing w:line="285" w:lineRule="atLeast"/>
         <w:rPr>
           <w:rFonts w:asciiTheme="minorHAnsi" w:hAnsiTheme="minorHAnsi" w:cstheme="minorHAnsi"/>
-          <w:color w:val="333333"/>
-          <w:szCs w:val="20"/>
-        </w:rPr>
-      </w:pPr>
-      <w:r>
-        <w:rPr>
-          <w:rFonts w:asciiTheme="minorHAnsi" w:hAnsiTheme="minorHAnsi" w:cstheme="minorHAnsi"/>
-          <w:color w:val="333333"/>
+          <w:szCs w:val="20"/>
+        </w:rPr>
+      </w:pPr>
+      <w:r>
+        <w:rPr>
+          <w:rFonts w:asciiTheme="minorHAnsi" w:hAnsiTheme="minorHAnsi" w:cstheme="minorHAnsi"/>
           <w:szCs w:val="20"/>
         </w:rPr>
         <w:t>Die Schulung findet als Blockveranstaltung an 3 aufeinanderfolgenden Werktagen voraussichtlich in Kalenderwoche 2</w:t>
@@ -1553,7 +1376,6 @@
       <w:r>
         <w:rPr>
           <w:rFonts w:asciiTheme="minorHAnsi" w:hAnsiTheme="minorHAnsi" w:cstheme="minorHAnsi"/>
-          <w:color w:val="333333"/>
           <w:szCs w:val="20"/>
         </w:rPr>
         <w:t>7</w:t>
@@ -1561,7 +1383,6 @@
       <w:r>
         <w:rPr>
           <w:rFonts w:asciiTheme="minorHAnsi" w:hAnsiTheme="minorHAnsi" w:cstheme="minorHAnsi"/>
-          <w:color w:val="333333"/>
           <w:szCs w:val="20"/>
         </w:rPr>
         <w:t xml:space="preserve"> statt. Die endgültige Festlegung der Schulungstermine erfolgt in Rücksprache mit Ihnen nach </w:t>
@@ -1569,7 +1390,6 @@
       <w:r>
         <w:rPr>
           <w:rFonts w:asciiTheme="minorHAnsi" w:hAnsiTheme="minorHAnsi" w:cstheme="minorHAnsi"/>
-          <w:color w:val="333333"/>
           <w:szCs w:val="20"/>
         </w:rPr>
         <w:t>Auftragserteilung.</w:t>
@@ -1583,7 +1403,6 @@
           <w:rFonts w:asciiTheme="minorHAnsi" w:hAnsiTheme="minorHAnsi" w:cstheme="minorHAnsi"/>
           <w:b/>
           <w:bCs/>
-          <w:color w:val="333333"/>
           <w:szCs w:val="20"/>
         </w:rPr>
       </w:pPr>
@@ -1592,7 +1411,6 @@
           <w:rFonts w:asciiTheme="minorHAnsi" w:hAnsiTheme="minorHAnsi" w:cstheme="minorHAnsi"/>
           <w:b/>
           <w:bCs/>
-          <w:color w:val="333333"/>
           <w:szCs w:val="20"/>
         </w:rPr>
         <w:t>Inhalte</w:t>
@@ -1604,14 +1422,12 @@
         <w:spacing w:line="285" w:lineRule="atLeast"/>
         <w:rPr>
           <w:rFonts w:asciiTheme="minorHAnsi" w:hAnsiTheme="minorHAnsi" w:cstheme="minorHAnsi"/>
-          <w:color w:val="333333"/>
-          <w:szCs w:val="20"/>
-        </w:rPr>
-      </w:pPr>
-      <w:r>
-        <w:rPr>
-          <w:rFonts w:asciiTheme="minorHAnsi" w:hAnsiTheme="minorHAnsi" w:cstheme="minorHAnsi"/>
-          <w:color w:val="333333"/>
+          <w:szCs w:val="20"/>
+        </w:rPr>
+      </w:pPr>
+      <w:r>
+        <w:rPr>
+          <w:rFonts w:asciiTheme="minorHAnsi" w:hAnsiTheme="minorHAnsi" w:cstheme="minorHAnsi"/>
           <w:szCs w:val="20"/>
         </w:rPr>
         <w:t xml:space="preserve">Anhand einer Mischung aus Vortrag, Live-Coding und praktischen Übungen werden den Teilnehmenden zunächst die Grundlagen der Datenanalyse in R vermittelt. Dies beinhaltet neben R spezifischen Themen wie die Syntax, den wichtigsten Funktionen und den etablierten Datenstrukturen, auch allgemeine programmiertechnische Konzepte wie Bedingungen, Schleifen und Funktionen. Basierend auf den vermittelten Grundlagen können </w:t>
@@ -1619,7 +1435,6 @@
       <w:r>
         <w:rPr>
           <w:rFonts w:asciiTheme="minorHAnsi" w:hAnsiTheme="minorHAnsi" w:cstheme="minorHAnsi"/>
-          <w:color w:val="333333"/>
           <w:szCs w:val="20"/>
         </w:rPr>
         <w:t>anschließend</w:t>
@@ -1627,7 +1442,6 @@
       <w:r>
         <w:rPr>
           <w:rFonts w:asciiTheme="minorHAnsi" w:hAnsiTheme="minorHAnsi" w:cstheme="minorHAnsi"/>
-          <w:color w:val="333333"/>
           <w:szCs w:val="20"/>
         </w:rPr>
         <w:t xml:space="preserve"> spezifische Inhalte aus dem Kontext der Bundeswaldinventur </w:t>
@@ -1635,7 +1449,6 @@
       <w:r>
         <w:rPr>
           <w:rFonts w:asciiTheme="minorHAnsi" w:hAnsiTheme="minorHAnsi" w:cstheme="minorHAnsi"/>
-          <w:color w:val="333333"/>
           <w:szCs w:val="20"/>
         </w:rPr>
         <w:t>eingehend behandelt werden. Hier werden über Beispiele und praktische Übungen die Teilnehmenden vorbereitet</w:t>
@@ -1643,7 +1456,6 @@
       <w:r>
         <w:rPr>
           <w:rFonts w:asciiTheme="minorHAnsi" w:hAnsiTheme="minorHAnsi" w:cstheme="minorHAnsi"/>
-          <w:color w:val="333333"/>
           <w:szCs w:val="20"/>
         </w:rPr>
         <w:t xml:space="preserve">, </w:t>
@@ -1651,7 +1463,6 @@
       <w:r>
         <w:rPr>
           <w:rFonts w:asciiTheme="minorHAnsi" w:hAnsiTheme="minorHAnsi" w:cstheme="minorHAnsi"/>
-          <w:color w:val="333333"/>
           <w:szCs w:val="20"/>
         </w:rPr>
         <w:t xml:space="preserve">zukünftig eigenständig Zusammenhänge in Datensätzen der BWI erkennen, und mittels statistischer Methoden und aussagekräftigen Grafiken wissenschaftlich belastbar beurteilen zu können. </w:t>
@@ -1665,7 +1476,6 @@
           <w:rFonts w:asciiTheme="minorHAnsi" w:hAnsiTheme="minorHAnsi" w:cstheme="minorHAnsi"/>
           <w:b/>
           <w:bCs/>
-          <w:color w:val="333333"/>
           <w:szCs w:val="20"/>
         </w:rPr>
       </w:pPr>
@@ -1674,7 +1484,6 @@
           <w:rFonts w:asciiTheme="minorHAnsi" w:hAnsiTheme="minorHAnsi" w:cstheme="minorHAnsi"/>
           <w:b/>
           <w:bCs/>
-          <w:color w:val="333333"/>
           <w:szCs w:val="20"/>
         </w:rPr>
         <w:t>Leistungen</w:t>
@@ -1686,22 +1495,33 @@
         <w:spacing w:line="285" w:lineRule="atLeast"/>
         <w:rPr>
           <w:rFonts w:asciiTheme="minorHAnsi" w:hAnsiTheme="minorHAnsi" w:cstheme="minorHAnsi"/>
-          <w:color w:val="333333"/>
-          <w:szCs w:val="20"/>
-        </w:rPr>
-      </w:pPr>
-      <w:r>
-        <w:rPr>
-          <w:rFonts w:asciiTheme="minorHAnsi" w:hAnsiTheme="minorHAnsi" w:cstheme="minorHAnsi"/>
-          <w:color w:val="333333"/>
-          <w:szCs w:val="20"/>
-        </w:rPr>
-        <w:t xml:space="preserve">Den Teilnehmenden steht mein gesammelter Erfahrungsschatz aus beinahe 10 Jahren täglicher Arbeit mit der Programmiersprache R zur Verfügung. Des Weiteren ist mein inhaltlicher Arbeitsschwerpunkt als M.Sc. Umweltwissenschaftler seit </w:t>
-      </w:r>
-      <w:r>
-        <w:rPr>
-          <w:rFonts w:asciiTheme="minorHAnsi" w:hAnsiTheme="minorHAnsi" w:cstheme="minorHAnsi"/>
-          <w:color w:val="333333"/>
+          <w:szCs w:val="20"/>
+        </w:rPr>
+      </w:pPr>
+      <w:r>
+        <w:rPr>
+          <w:rFonts w:asciiTheme="minorHAnsi" w:hAnsiTheme="minorHAnsi" w:cstheme="minorHAnsi"/>
+          <w:szCs w:val="20"/>
+        </w:rPr>
+        <w:t xml:space="preserve">Den Teilnehmenden steht mein gesammelter Erfahrungsschatz aus </w:t>
+      </w:r>
+      <w:r>
+        <w:rPr>
+          <w:rFonts w:asciiTheme="minorHAnsi" w:hAnsiTheme="minorHAnsi" w:cstheme="minorHAnsi"/>
+          <w:szCs w:val="20"/>
+        </w:rPr>
+        <w:t>über</w:t>
+      </w:r>
+      <w:r>
+        <w:rPr>
+          <w:rFonts w:asciiTheme="minorHAnsi" w:hAnsiTheme="minorHAnsi" w:cstheme="minorHAnsi"/>
+          <w:szCs w:val="20"/>
+        </w:rPr>
+        <w:t xml:space="preserve"> 10 Jahren täglicher Arbeit mit der Programmiersprache R zur Verfügung. Des Weiteren ist mein inhaltlicher Arbeitsschwerpunkt als M.Sc. Umweltwissenschaftler seit </w:t>
+      </w:r>
+      <w:r>
+        <w:rPr>
+          <w:rFonts w:asciiTheme="minorHAnsi" w:hAnsiTheme="minorHAnsi" w:cstheme="minorHAnsi"/>
           <w:szCs w:val="20"/>
         </w:rPr>
         <w:t>Anfang 2020</w:t>
@@ -1709,7 +1529,6 @@
       <w:r>
         <w:rPr>
           <w:rFonts w:asciiTheme="minorHAnsi" w:hAnsiTheme="minorHAnsi" w:cstheme="minorHAnsi"/>
-          <w:color w:val="333333"/>
           <w:szCs w:val="20"/>
         </w:rPr>
         <w:t xml:space="preserve"> die wissenschaftliche Fortentwicklung der Holzaufkommensmodellierung basierend auf der Bundeswaldinventur. Bei all der Routine im Umgang mit R und</w:t>
@@ -1717,7 +1536,6 @@
       <w:r>
         <w:rPr>
           <w:rFonts w:asciiTheme="minorHAnsi" w:hAnsiTheme="minorHAnsi" w:cstheme="minorHAnsi"/>
-          <w:color w:val="333333"/>
           <w:szCs w:val="20"/>
         </w:rPr>
         <w:t xml:space="preserve"> der</w:t>
@@ -1725,7 +1543,6 @@
       <w:r>
         <w:rPr>
           <w:rFonts w:asciiTheme="minorHAnsi" w:hAnsiTheme="minorHAnsi" w:cstheme="minorHAnsi"/>
-          <w:color w:val="333333"/>
           <w:szCs w:val="20"/>
         </w:rPr>
         <w:t xml:space="preserve"> BWI ist mir allerdings bewusst wie fordernd, und zum Teil auch frustrierend</w:t>
@@ -1733,7 +1550,6 @@
       <w:r>
         <w:rPr>
           <w:rFonts w:asciiTheme="minorHAnsi" w:hAnsiTheme="minorHAnsi" w:cstheme="minorHAnsi"/>
-          <w:color w:val="333333"/>
           <w:szCs w:val="20"/>
         </w:rPr>
         <w:t>,</w:t>
@@ -1741,7 +1557,6 @@
       <w:r>
         <w:rPr>
           <w:rFonts w:asciiTheme="minorHAnsi" w:hAnsiTheme="minorHAnsi" w:cstheme="minorHAnsi"/>
-          <w:color w:val="333333"/>
           <w:szCs w:val="20"/>
         </w:rPr>
         <w:t xml:space="preserve"> der Erstkontakt mit einer fremden Programmiersprache und neuen inhaltliche Konzepten sein kann. Seit Ende 2023 studiere ich berufsbegleitend Informatik und habe seitdem </w:t>
@@ -1749,7 +1564,6 @@
       <w:r>
         <w:rPr>
           <w:rFonts w:asciiTheme="minorHAnsi" w:hAnsiTheme="minorHAnsi" w:cstheme="minorHAnsi"/>
-          <w:color w:val="333333"/>
           <w:szCs w:val="20"/>
         </w:rPr>
         <w:t>nicht nur die Programmiersprachen Python, C++ und C# erlernt, sondern auch die ein oder andere Übung in Demut mit diesen neuen Inhalten machen dürfen. Daher ist es mir besonders wichtig im Schulungssetting eine Atmosphäre zu schaffen in der es keine dummen Fragen gibt, in welchem stets die positive Lernerfahrung der Teilnehmenden im Vordergrund steht und sich niemand abgehängt fühlt.</w:t>
@@ -1761,41 +1575,15 @@
         <w:spacing w:line="285" w:lineRule="atLeast"/>
         <w:rPr>
           <w:rFonts w:asciiTheme="minorHAnsi" w:hAnsiTheme="minorHAnsi" w:cstheme="minorHAnsi"/>
-          <w:color w:val="333333"/>
-          <w:szCs w:val="20"/>
-        </w:rPr>
-      </w:pPr>
-      <w:r>
-        <w:rPr>
-          <w:rFonts w:asciiTheme="minorHAnsi" w:hAnsiTheme="minorHAnsi" w:cstheme="minorHAnsi"/>
-          <w:color w:val="333333"/>
-          <w:szCs w:val="20"/>
-        </w:rPr>
-        <w:t>Ich</w:t>
-      </w:r>
-      <w:r>
-        <w:rPr>
-          <w:rFonts w:asciiTheme="minorHAnsi" w:hAnsiTheme="minorHAnsi" w:cstheme="minorHAnsi"/>
-          <w:color w:val="333333"/>
-          <w:szCs w:val="20"/>
-        </w:rPr>
-        <w:t xml:space="preserve"> hoffe, mit diesem Angebot die Grundlage für eine gute zukünftige Zusammenarbeit gelegt zu haben und freue</w:t>
-      </w:r>
-      <w:r>
-        <w:rPr>
-          <w:rFonts w:asciiTheme="minorHAnsi" w:hAnsiTheme="minorHAnsi" w:cstheme="minorHAnsi"/>
-          <w:color w:val="333333"/>
-          <w:szCs w:val="20"/>
-        </w:rPr>
-        <w:t xml:space="preserve"> mich</w:t>
-      </w:r>
-      <w:r>
-        <w:rPr>
-          <w:rFonts w:asciiTheme="minorHAnsi" w:hAnsiTheme="minorHAnsi" w:cstheme="minorHAnsi"/>
-          <w:color w:val="333333"/>
-          <w:szCs w:val="20"/>
-        </w:rPr>
-        <w:t xml:space="preserve"> auf Ihre Rückmeldung.</w:t>
+          <w:szCs w:val="20"/>
+        </w:rPr>
+      </w:pPr>
+      <w:r>
+        <w:rPr>
+          <w:rFonts w:asciiTheme="minorHAnsi" w:hAnsiTheme="minorHAnsi" w:cstheme="minorHAnsi"/>
+          <w:szCs w:val="20"/>
+        </w:rPr>
+        <w:t>Ich hoffe, mit diesem Angebot die Grundlage für eine gute zukünftige Zusammenarbeit gelegt zu haben und freue mich auf Ihre Rückmeldung.</w:t>
       </w:r>
     </w:p>
     <w:p>
@@ -1804,14 +1592,12 @@
         <w:spacing w:line="285" w:lineRule="atLeast"/>
         <w:rPr>
           <w:rFonts w:asciiTheme="minorHAnsi" w:hAnsiTheme="minorHAnsi" w:cstheme="minorHAnsi"/>
-          <w:color w:val="333333"/>
-          <w:szCs w:val="20"/>
-        </w:rPr>
-      </w:pPr>
-      <w:r>
-        <w:rPr>
-          <w:rFonts w:asciiTheme="minorHAnsi" w:hAnsiTheme="minorHAnsi" w:cstheme="minorHAnsi"/>
-          <w:color w:val="333333"/>
+          <w:szCs w:val="20"/>
+        </w:rPr>
+      </w:pPr>
+      <w:r>
+        <w:rPr>
+          <w:rFonts w:asciiTheme="minorHAnsi" w:hAnsiTheme="minorHAnsi" w:cstheme="minorHAnsi"/>
           <w:szCs w:val="20"/>
         </w:rPr>
         <w:t>Mit freundlichen Grüßen </w:t>
@@ -1819,7 +1605,6 @@
       <w:r>
         <w:rPr>
           <w:rFonts w:asciiTheme="minorHAnsi" w:hAnsiTheme="minorHAnsi" w:cstheme="minorHAnsi"/>
-          <w:color w:val="333333"/>
           <w:szCs w:val="20"/>
         </w:rPr>
         <w:t xml:space="preserve">                            </w:t>
@@ -1831,7 +1616,26 @@
         <w:spacing w:line="285" w:lineRule="atLeast"/>
         <w:rPr>
           <w:rFonts w:asciiTheme="minorHAnsi" w:hAnsiTheme="minorHAnsi" w:cstheme="minorHAnsi"/>
-          <w:color w:val="333333"/>
+          <w:szCs w:val="20"/>
+        </w:rPr>
+      </w:pPr>
+    </w:p>
+    <w:p>
+      <w:pPr>
+        <w:pStyle w:val="StandardWeb"/>
+        <w:spacing w:line="285" w:lineRule="atLeast"/>
+        <w:rPr>
+          <w:rFonts w:asciiTheme="minorHAnsi" w:hAnsiTheme="minorHAnsi" w:cstheme="minorHAnsi"/>
+          <w:szCs w:val="20"/>
+        </w:rPr>
+      </w:pPr>
+    </w:p>
+    <w:p>
+      <w:pPr>
+        <w:pStyle w:val="StandardWeb"/>
+        <w:spacing w:line="285" w:lineRule="atLeast"/>
+        <w:rPr>
+          <w:rFonts w:asciiTheme="minorHAnsi" w:hAnsiTheme="minorHAnsi" w:cstheme="minorHAnsi"/>
           <w:szCs w:val="20"/>
         </w:rPr>
       </w:pPr>
@@ -1842,14 +1646,12 @@
         <w:spacing w:after="0" w:afterAutospacing="0" w:line="285" w:lineRule="atLeast"/>
         <w:rPr>
           <w:rFonts w:asciiTheme="minorHAnsi" w:hAnsiTheme="minorHAnsi" w:cstheme="minorHAnsi"/>
-          <w:color w:val="333333"/>
-          <w:szCs w:val="20"/>
-        </w:rPr>
-      </w:pPr>
-      <w:r>
-        <w:rPr>
-          <w:rFonts w:asciiTheme="minorHAnsi" w:hAnsiTheme="minorHAnsi" w:cstheme="minorHAnsi"/>
-          <w:color w:val="333333"/>
+          <w:szCs w:val="20"/>
+        </w:rPr>
+      </w:pPr>
+      <w:r>
+        <w:rPr>
+          <w:rFonts w:asciiTheme="minorHAnsi" w:hAnsiTheme="minorHAnsi" w:cstheme="minorHAnsi"/>
           <w:szCs w:val="20"/>
         </w:rPr>
         <w:t xml:space="preserve">Florian </w:t>
@@ -1857,7 +1659,6 @@
       <w:r>
         <w:rPr>
           <w:rFonts w:asciiTheme="minorHAnsi" w:hAnsiTheme="minorHAnsi" w:cstheme="minorHAnsi"/>
-          <w:color w:val="333333"/>
           <w:szCs w:val="20"/>
         </w:rPr>
         <w:t>Keppeler</w:t>
@@ -1867,6 +1668,7 @@
       <w:pPr>
         <w:rPr>
           <w:rFonts w:cstheme="minorHAnsi"/>
+          <w:vertAlign w:val="superscript"/>
         </w:rPr>
       </w:pPr>
     </w:p>

</xml_diff>